<commit_message>
Remove remaining Daraz branding references
Shopnix is presented as its own standalone project now, not as a
clone/tribute of a specific real marketplace.

Co-Authored-By: Claude Sonnet 5 <noreply@anthropic.com>
</commit_message>
<xml_diff>
--- a/project.docx
+++ b/project.docx
@@ -18,7 +18,7 @@
         <w:rPr>
           <w:i/>
         </w:rPr>
-        <w:t>A Daraz-inspired demo e-commerce marketplace</w:t>
+        <w:t>A demo e-commerce marketplace</w:t>
       </w:r>
     </w:p>
     <w:p/>
@@ -36,7 +36,7 @@
           <w:b w:val="0"/>
           <w:i w:val="0"/>
         </w:rPr>
-        <w:t>Shopnix is a client-side e-commerce marketplace demo with a teal &amp; coral theme, inspired by Daraz. It began as a fully static site (plain HTML/CSS/JS, no framework, no build step) and is now mid-migration to a Supabase-backed product catalog, with cart, wishlist, and authentication still implemented client-side.</w:t>
+        <w:t>Shopnix is a client-side e-commerce marketplace demo with a teal &amp; coral theme. It began as a fully static site (plain HTML/CSS/JS, no framework, no build step) and is now mid-migration to a Supabase-backed product catalog, with cart, wishlist, and authentication still implemented client-side.</w:t>
       </w:r>
     </w:p>
     <w:p>

</xml_diff>